<commit_message>
Publish paper reproducibility artifacts
Include the cited Linear model, dataset, screening and TMM audit results, source, tests, and final manuscript.

Co-authored-by: Copilot <223556219+Copilot@users.noreply.github.com>
</commit_message>
<xml_diff>
--- a/paper/AI4S_ThinFilm_Research_Article_Submission.docx
+++ b/paper/AI4S_ThinFilm_Research_Article_Submission.docx
@@ -7,6 +7,8 @@
         <w:widowControl/>
         <w:spacing w:after="30" w:line="240" w:lineRule="auto"/>
       </w:pPr>
+      <w:bookmarkStart w:id="0" w:name="_GoBack"/>
+      <w:bookmarkEnd w:id="0"/>
       <w:r>
         <w:rPr>
           <w:b/>
@@ -84,19 +86,7 @@
           <w:sz w:val="20"/>
           <w:lang w:eastAsia="zh-CN"/>
         </w:rPr>
-        <w:t>_</w:t>
-      </w:r>
-      <w:bookmarkStart w:id="0" w:name="_GoBack"/>
-      <w:bookmarkEnd w:id="0"/>
-      <w:r>
-        <w:rPr>
-          <w:rFonts w:hint="eastAsia" w:eastAsia="宋体"/>
-          <w:b w:val="0"/>
-          <w:i w:val="0"/>
-          <w:sz w:val="20"/>
-          <w:lang w:eastAsia="zh-CN"/>
-        </w:rPr>
-        <w:t xml:space="preserve">    学号：2024270256</w:t>
+        <w:t>_    学号：2024270256</w:t>
       </w:r>
     </w:p>
     <w:p>
@@ -999,7 +989,7 @@
           <w:p>
             <w:pPr>
               <w:widowControl/>
-              <w:spacing w:after="0" w:line="230" w:lineRule="auto" w:before="0"/>
+              <w:spacing w:before="0" w:after="0" w:line="230" w:lineRule="auto"/>
               <w:ind w:left="0" w:right="0"/>
               <w:jc w:val="center"/>
               <w:rPr>
@@ -1029,7 +1019,7 @@
           <w:p>
             <w:pPr>
               <w:widowControl/>
-              <w:spacing w:after="0" w:line="230" w:lineRule="auto" w:before="0"/>
+              <w:spacing w:before="0" w:after="0" w:line="230" w:lineRule="auto"/>
               <w:ind w:left="0" w:right="0"/>
               <w:jc w:val="center"/>
               <w:rPr>
@@ -1059,7 +1049,7 @@
           <w:p>
             <w:pPr>
               <w:widowControl/>
-              <w:spacing w:after="0" w:line="230" w:lineRule="auto" w:before="0"/>
+              <w:spacing w:before="0" w:after="0" w:line="230" w:lineRule="auto"/>
               <w:ind w:left="0" w:right="0"/>
               <w:jc w:val="center"/>
               <w:rPr>
@@ -1086,7 +1076,7 @@
           <w:p>
             <w:pPr>
               <w:widowControl/>
-              <w:spacing w:after="0" w:line="230" w:lineRule="auto" w:before="0"/>
+              <w:spacing w:before="0" w:after="0" w:line="230" w:lineRule="auto"/>
               <w:ind w:left="0" w:right="0"/>
               <w:jc w:val="center"/>
               <w:rPr>
@@ -1116,7 +1106,7 @@
           <w:p>
             <w:pPr>
               <w:widowControl/>
-              <w:spacing w:after="0" w:line="230" w:lineRule="auto" w:before="0"/>
+              <w:spacing w:before="0" w:after="0" w:line="230" w:lineRule="auto"/>
               <w:ind w:left="0" w:right="0"/>
               <w:jc w:val="center"/>
               <w:rPr>
@@ -1167,7 +1157,7 @@
           <w:p>
             <w:pPr>
               <w:widowControl/>
-              <w:spacing w:after="0" w:line="230" w:lineRule="auto" w:before="0"/>
+              <w:spacing w:before="0" w:after="0" w:line="230" w:lineRule="auto"/>
               <w:ind w:left="0" w:right="0"/>
               <w:jc w:val="center"/>
               <w:rPr>
@@ -1195,7 +1185,7 @@
           <w:p>
             <w:pPr>
               <w:widowControl/>
-              <w:spacing w:after="0" w:line="230" w:lineRule="auto" w:before="0"/>
+              <w:spacing w:before="0" w:after="0" w:line="230" w:lineRule="auto"/>
               <w:ind w:left="0" w:right="0"/>
               <w:jc w:val="center"/>
               <w:rPr>
@@ -1223,7 +1213,7 @@
           <w:p>
             <w:pPr>
               <w:widowControl/>
-              <w:spacing w:after="0" w:line="230" w:lineRule="auto" w:before="0"/>
+              <w:spacing w:before="0" w:after="0" w:line="230" w:lineRule="auto"/>
               <w:ind w:left="0" w:right="0"/>
               <w:jc w:val="center"/>
               <w:rPr>
@@ -1251,7 +1241,7 @@
           <w:p>
             <w:pPr>
               <w:widowControl/>
-              <w:spacing w:after="0" w:line="230" w:lineRule="auto" w:before="0"/>
+              <w:spacing w:before="0" w:after="0" w:line="230" w:lineRule="auto"/>
               <w:ind w:left="0" w:right="0"/>
               <w:jc w:val="center"/>
               <w:rPr>
@@ -1279,7 +1269,7 @@
           <w:p>
             <w:pPr>
               <w:widowControl/>
-              <w:spacing w:after="0" w:line="230" w:lineRule="auto" w:before="0"/>
+              <w:spacing w:before="0" w:after="0" w:line="230" w:lineRule="auto"/>
               <w:ind w:left="0" w:right="0"/>
               <w:jc w:val="center"/>
               <w:rPr>
@@ -1328,7 +1318,7 @@
           <w:p>
             <w:pPr>
               <w:widowControl/>
-              <w:spacing w:after="0" w:line="230" w:lineRule="auto" w:before="0"/>
+              <w:spacing w:before="0" w:after="0" w:line="230" w:lineRule="auto"/>
               <w:ind w:left="0" w:right="0"/>
               <w:jc w:val="center"/>
               <w:rPr>
@@ -1356,7 +1346,7 @@
           <w:p>
             <w:pPr>
               <w:widowControl/>
-              <w:spacing w:after="0" w:line="230" w:lineRule="auto" w:before="0"/>
+              <w:spacing w:before="0" w:after="0" w:line="230" w:lineRule="auto"/>
               <w:ind w:left="0" w:right="0"/>
               <w:jc w:val="center"/>
               <w:rPr>
@@ -1384,7 +1374,7 @@
           <w:p>
             <w:pPr>
               <w:widowControl/>
-              <w:spacing w:after="0" w:line="230" w:lineRule="auto" w:before="0"/>
+              <w:spacing w:before="0" w:after="0" w:line="230" w:lineRule="auto"/>
               <w:ind w:left="0" w:right="0"/>
               <w:jc w:val="center"/>
               <w:rPr>
@@ -1412,7 +1402,7 @@
           <w:p>
             <w:pPr>
               <w:widowControl/>
-              <w:spacing w:after="0" w:line="230" w:lineRule="auto" w:before="0"/>
+              <w:spacing w:before="0" w:after="0" w:line="230" w:lineRule="auto"/>
               <w:ind w:left="0" w:right="0"/>
               <w:jc w:val="center"/>
               <w:rPr>
@@ -1440,7 +1430,7 @@
           <w:p>
             <w:pPr>
               <w:widowControl/>
-              <w:spacing w:after="0" w:line="230" w:lineRule="auto" w:before="0"/>
+              <w:spacing w:before="0" w:after="0" w:line="230" w:lineRule="auto"/>
               <w:ind w:left="0" w:right="0"/>
               <w:jc w:val="center"/>
               <w:rPr>
@@ -1489,7 +1479,7 @@
           <w:p>
             <w:pPr>
               <w:widowControl/>
-              <w:spacing w:after="0" w:line="230" w:lineRule="auto" w:before="0"/>
+              <w:spacing w:before="0" w:after="0" w:line="230" w:lineRule="auto"/>
               <w:ind w:left="0" w:right="0"/>
               <w:jc w:val="center"/>
               <w:rPr>
@@ -1517,7 +1507,7 @@
           <w:p>
             <w:pPr>
               <w:widowControl/>
-              <w:spacing w:after="0" w:line="230" w:lineRule="auto" w:before="0"/>
+              <w:spacing w:before="0" w:after="0" w:line="230" w:lineRule="auto"/>
               <w:ind w:left="0" w:right="0"/>
               <w:jc w:val="center"/>
               <w:rPr>
@@ -1545,7 +1535,7 @@
           <w:p>
             <w:pPr>
               <w:widowControl/>
-              <w:spacing w:after="0" w:line="230" w:lineRule="auto" w:before="0"/>
+              <w:spacing w:before="0" w:after="0" w:line="230" w:lineRule="auto"/>
               <w:ind w:left="0" w:right="0"/>
               <w:jc w:val="center"/>
               <w:rPr>
@@ -1573,7 +1563,7 @@
           <w:p>
             <w:pPr>
               <w:widowControl/>
-              <w:spacing w:after="0" w:line="230" w:lineRule="auto" w:before="0"/>
+              <w:spacing w:before="0" w:after="0" w:line="230" w:lineRule="auto"/>
               <w:ind w:left="0" w:right="0"/>
               <w:jc w:val="center"/>
               <w:rPr>
@@ -1601,7 +1591,7 @@
           <w:p>
             <w:pPr>
               <w:widowControl/>
-              <w:spacing w:after="0" w:line="230" w:lineRule="auto" w:before="0"/>
+              <w:spacing w:before="0" w:after="0" w:line="230" w:lineRule="auto"/>
               <w:ind w:left="0" w:right="0"/>
               <w:jc w:val="center"/>
               <w:rPr>
@@ -1650,7 +1640,7 @@
           <w:p>
             <w:pPr>
               <w:widowControl/>
-              <w:spacing w:after="0" w:line="230" w:lineRule="auto" w:before="0"/>
+              <w:spacing w:before="0" w:after="0" w:line="230" w:lineRule="auto"/>
               <w:ind w:left="0" w:right="0"/>
               <w:jc w:val="center"/>
               <w:rPr>
@@ -1678,7 +1668,7 @@
           <w:p>
             <w:pPr>
               <w:widowControl/>
-              <w:spacing w:after="0" w:line="230" w:lineRule="auto" w:before="0"/>
+              <w:spacing w:before="0" w:after="0" w:line="230" w:lineRule="auto"/>
               <w:ind w:left="0" w:right="0"/>
               <w:jc w:val="center"/>
               <w:rPr>
@@ -1706,7 +1696,7 @@
           <w:p>
             <w:pPr>
               <w:widowControl/>
-              <w:spacing w:after="0" w:line="230" w:lineRule="auto" w:before="0"/>
+              <w:spacing w:before="0" w:after="0" w:line="230" w:lineRule="auto"/>
               <w:ind w:left="0" w:right="0"/>
               <w:jc w:val="center"/>
               <w:rPr>
@@ -1734,7 +1724,7 @@
           <w:p>
             <w:pPr>
               <w:widowControl/>
-              <w:spacing w:after="0" w:line="230" w:lineRule="auto" w:before="0"/>
+              <w:spacing w:before="0" w:after="0" w:line="230" w:lineRule="auto"/>
               <w:ind w:left="0" w:right="0"/>
               <w:jc w:val="center"/>
               <w:rPr>
@@ -1762,7 +1752,7 @@
           <w:p>
             <w:pPr>
               <w:widowControl/>
-              <w:spacing w:after="0" w:line="230" w:lineRule="auto" w:before="0"/>
+              <w:spacing w:before="0" w:after="0" w:line="230" w:lineRule="auto"/>
               <w:ind w:left="0" w:right="0"/>
               <w:jc w:val="center"/>
               <w:rPr>
@@ -1811,7 +1801,7 @@
           <w:p>
             <w:pPr>
               <w:widowControl/>
-              <w:spacing w:after="0" w:line="230" w:lineRule="auto" w:before="0"/>
+              <w:spacing w:before="0" w:after="0" w:line="230" w:lineRule="auto"/>
               <w:ind w:left="0" w:right="0"/>
               <w:jc w:val="center"/>
               <w:rPr>
@@ -1839,7 +1829,7 @@
           <w:p>
             <w:pPr>
               <w:widowControl/>
-              <w:spacing w:after="0" w:line="230" w:lineRule="auto" w:before="0"/>
+              <w:spacing w:before="0" w:after="0" w:line="230" w:lineRule="auto"/>
               <w:ind w:left="0" w:right="0"/>
               <w:jc w:val="center"/>
               <w:rPr>
@@ -1867,7 +1857,7 @@
           <w:p>
             <w:pPr>
               <w:widowControl/>
-              <w:spacing w:after="0" w:line="230" w:lineRule="auto" w:before="0"/>
+              <w:spacing w:before="0" w:after="0" w:line="230" w:lineRule="auto"/>
               <w:ind w:left="0" w:right="0"/>
               <w:jc w:val="center"/>
               <w:rPr>
@@ -1895,7 +1885,7 @@
           <w:p>
             <w:pPr>
               <w:widowControl/>
-              <w:spacing w:after="0" w:line="230" w:lineRule="auto" w:before="0"/>
+              <w:spacing w:before="0" w:after="0" w:line="230" w:lineRule="auto"/>
               <w:ind w:left="0" w:right="0"/>
               <w:jc w:val="center"/>
               <w:rPr>
@@ -1923,7 +1913,7 @@
           <w:p>
             <w:pPr>
               <w:widowControl/>
-              <w:spacing w:after="0" w:line="230" w:lineRule="auto" w:before="0"/>
+              <w:spacing w:before="0" w:after="0" w:line="230" w:lineRule="auto"/>
               <w:ind w:left="0" w:right="0"/>
               <w:jc w:val="center"/>
               <w:rPr>
@@ -1972,7 +1962,7 @@
           <w:p>
             <w:pPr>
               <w:widowControl/>
-              <w:spacing w:after="0" w:line="230" w:lineRule="auto" w:before="0"/>
+              <w:spacing w:before="0" w:after="0" w:line="230" w:lineRule="auto"/>
               <w:ind w:left="0" w:right="0"/>
               <w:jc w:val="center"/>
               <w:rPr>
@@ -2000,7 +1990,7 @@
           <w:p>
             <w:pPr>
               <w:widowControl/>
-              <w:spacing w:after="0" w:line="230" w:lineRule="auto" w:before="0"/>
+              <w:spacing w:before="0" w:after="0" w:line="230" w:lineRule="auto"/>
               <w:ind w:left="0" w:right="0"/>
               <w:jc w:val="center"/>
               <w:rPr>
@@ -2028,7 +2018,7 @@
           <w:p>
             <w:pPr>
               <w:widowControl/>
-              <w:spacing w:after="0" w:line="230" w:lineRule="auto" w:before="0"/>
+              <w:spacing w:before="0" w:after="0" w:line="230" w:lineRule="auto"/>
               <w:ind w:left="0" w:right="0"/>
               <w:jc w:val="center"/>
               <w:rPr>
@@ -2056,7 +2046,7 @@
           <w:p>
             <w:pPr>
               <w:widowControl/>
-              <w:spacing w:after="0" w:line="230" w:lineRule="auto" w:before="0"/>
+              <w:spacing w:before="0" w:after="0" w:line="230" w:lineRule="auto"/>
               <w:ind w:left="0" w:right="0"/>
               <w:jc w:val="center"/>
               <w:rPr>
@@ -2084,7 +2074,7 @@
           <w:p>
             <w:pPr>
               <w:widowControl/>
-              <w:spacing w:after="0" w:line="230" w:lineRule="auto" w:before="0"/>
+              <w:spacing w:before="0" w:after="0" w:line="230" w:lineRule="auto"/>
               <w:ind w:left="0" w:right="0"/>
               <w:jc w:val="center"/>
               <w:rPr>
@@ -2133,7 +2123,7 @@
           <w:p>
             <w:pPr>
               <w:widowControl/>
-              <w:spacing w:after="0" w:line="230" w:lineRule="auto" w:before="0"/>
+              <w:spacing w:before="0" w:after="0" w:line="230" w:lineRule="auto"/>
               <w:ind w:left="0" w:right="0"/>
               <w:jc w:val="center"/>
               <w:rPr>
@@ -2161,7 +2151,7 @@
           <w:p>
             <w:pPr>
               <w:widowControl/>
-              <w:spacing w:after="0" w:line="230" w:lineRule="auto" w:before="0"/>
+              <w:spacing w:before="0" w:after="0" w:line="230" w:lineRule="auto"/>
               <w:ind w:left="0" w:right="0"/>
               <w:jc w:val="center"/>
               <w:rPr>
@@ -2189,7 +2179,7 @@
           <w:p>
             <w:pPr>
               <w:widowControl/>
-              <w:spacing w:after="0" w:line="230" w:lineRule="auto" w:before="0"/>
+              <w:spacing w:before="0" w:after="0" w:line="230" w:lineRule="auto"/>
               <w:ind w:left="0" w:right="0"/>
               <w:jc w:val="center"/>
               <w:rPr>
@@ -2217,7 +2207,7 @@
           <w:p>
             <w:pPr>
               <w:widowControl/>
-              <w:spacing w:after="0" w:line="230" w:lineRule="auto" w:before="0"/>
+              <w:spacing w:before="0" w:after="0" w:line="230" w:lineRule="auto"/>
               <w:ind w:left="0" w:right="0"/>
               <w:jc w:val="center"/>
               <w:rPr>
@@ -2245,7 +2235,7 @@
           <w:p>
             <w:pPr>
               <w:widowControl/>
-              <w:spacing w:after="0" w:line="230" w:lineRule="auto" w:before="0"/>
+              <w:spacing w:before="0" w:after="0" w:line="230" w:lineRule="auto"/>
               <w:ind w:left="0" w:right="0"/>
               <w:jc w:val="center"/>
               <w:rPr>
@@ -2294,7 +2284,7 @@
           <w:p>
             <w:pPr>
               <w:widowControl/>
-              <w:spacing w:after="0" w:line="230" w:lineRule="auto" w:before="0"/>
+              <w:spacing w:before="0" w:after="0" w:line="230" w:lineRule="auto"/>
               <w:ind w:left="0" w:right="0"/>
               <w:jc w:val="center"/>
               <w:rPr>
@@ -2322,7 +2312,7 @@
           <w:p>
             <w:pPr>
               <w:widowControl/>
-              <w:spacing w:after="0" w:line="230" w:lineRule="auto" w:before="0"/>
+              <w:spacing w:before="0" w:after="0" w:line="230" w:lineRule="auto"/>
               <w:ind w:left="0" w:right="0"/>
               <w:jc w:val="center"/>
               <w:rPr>
@@ -2350,7 +2340,7 @@
           <w:p>
             <w:pPr>
               <w:widowControl/>
-              <w:spacing w:after="0" w:line="230" w:lineRule="auto" w:before="0"/>
+              <w:spacing w:before="0" w:after="0" w:line="230" w:lineRule="auto"/>
               <w:ind w:left="0" w:right="0"/>
               <w:jc w:val="center"/>
               <w:rPr>
@@ -2378,7 +2368,7 @@
           <w:p>
             <w:pPr>
               <w:widowControl/>
-              <w:spacing w:after="0" w:line="230" w:lineRule="auto" w:before="0"/>
+              <w:spacing w:before="0" w:after="0" w:line="230" w:lineRule="auto"/>
               <w:ind w:left="0" w:right="0"/>
               <w:jc w:val="center"/>
               <w:rPr>
@@ -2406,7 +2396,7 @@
           <w:p>
             <w:pPr>
               <w:widowControl/>
-              <w:spacing w:after="0" w:line="230" w:lineRule="auto" w:before="0"/>
+              <w:spacing w:before="0" w:after="0" w:line="230" w:lineRule="auto"/>
               <w:ind w:left="0" w:right="0"/>
               <w:jc w:val="center"/>
               <w:rPr>
@@ -2455,7 +2445,7 @@
           <w:p>
             <w:pPr>
               <w:widowControl/>
-              <w:spacing w:after="0" w:line="230" w:lineRule="auto" w:before="0"/>
+              <w:spacing w:before="0" w:after="0" w:line="230" w:lineRule="auto"/>
               <w:ind w:left="0" w:right="0"/>
               <w:jc w:val="center"/>
               <w:rPr>
@@ -2483,7 +2473,7 @@
           <w:p>
             <w:pPr>
               <w:widowControl/>
-              <w:spacing w:after="0" w:line="230" w:lineRule="auto" w:before="0"/>
+              <w:spacing w:before="0" w:after="0" w:line="230" w:lineRule="auto"/>
               <w:ind w:left="0" w:right="0"/>
               <w:jc w:val="center"/>
               <w:rPr>
@@ -2511,7 +2501,7 @@
           <w:p>
             <w:pPr>
               <w:widowControl/>
-              <w:spacing w:after="0" w:line="230" w:lineRule="auto" w:before="0"/>
+              <w:spacing w:before="0" w:after="0" w:line="230" w:lineRule="auto"/>
               <w:ind w:left="0" w:right="0"/>
               <w:jc w:val="center"/>
               <w:rPr>
@@ -2539,7 +2529,7 @@
           <w:p>
             <w:pPr>
               <w:widowControl/>
-              <w:spacing w:after="0" w:line="230" w:lineRule="auto" w:before="0"/>
+              <w:spacing w:before="0" w:after="0" w:line="230" w:lineRule="auto"/>
               <w:ind w:left="0" w:right="0"/>
               <w:jc w:val="center"/>
               <w:rPr>
@@ -2567,7 +2557,7 @@
           <w:p>
             <w:pPr>
               <w:widowControl/>
-              <w:spacing w:after="0" w:line="230" w:lineRule="auto" w:before="0"/>
+              <w:spacing w:before="0" w:after="0" w:line="230" w:lineRule="auto"/>
               <w:ind w:left="0" w:right="0"/>
               <w:jc w:val="center"/>
               <w:rPr>
@@ -2616,7 +2606,7 @@
           <w:p>
             <w:pPr>
               <w:widowControl/>
-              <w:spacing w:after="0" w:line="230" w:lineRule="auto" w:before="0"/>
+              <w:spacing w:before="0" w:after="0" w:line="230" w:lineRule="auto"/>
               <w:ind w:left="0" w:right="0"/>
               <w:jc w:val="center"/>
               <w:rPr>
@@ -2644,7 +2634,7 @@
           <w:p>
             <w:pPr>
               <w:widowControl/>
-              <w:spacing w:after="0" w:line="230" w:lineRule="auto" w:before="0"/>
+              <w:spacing w:before="0" w:after="0" w:line="230" w:lineRule="auto"/>
               <w:ind w:left="0" w:right="0"/>
               <w:jc w:val="center"/>
               <w:rPr>
@@ -2672,7 +2662,7 @@
           <w:p>
             <w:pPr>
               <w:widowControl/>
-              <w:spacing w:after="0" w:line="230" w:lineRule="auto" w:before="0"/>
+              <w:spacing w:before="0" w:after="0" w:line="230" w:lineRule="auto"/>
               <w:ind w:left="0" w:right="0"/>
               <w:jc w:val="center"/>
               <w:rPr>
@@ -2700,7 +2690,7 @@
           <w:p>
             <w:pPr>
               <w:widowControl/>
-              <w:spacing w:after="0" w:line="230" w:lineRule="auto" w:before="0"/>
+              <w:spacing w:before="0" w:after="0" w:line="230" w:lineRule="auto"/>
               <w:ind w:left="0" w:right="0"/>
               <w:jc w:val="center"/>
               <w:rPr>
@@ -2728,7 +2718,7 @@
           <w:p>
             <w:pPr>
               <w:widowControl/>
-              <w:spacing w:after="0" w:line="230" w:lineRule="auto" w:before="0"/>
+              <w:spacing w:before="0" w:after="0" w:line="230" w:lineRule="auto"/>
               <w:ind w:left="0" w:right="0"/>
               <w:jc w:val="center"/>
               <w:rPr>
@@ -2997,37 +2987,20 @@
     </w:p>
     <w:p>
       <w:pPr>
+        <w:pStyle w:val="2"/>
+        <w:keepNext/>
         <w:widowControl/>
-        <w:spacing w:after="30" w:line="240" w:lineRule="auto"/>
+        <w:rPr>
+          <w:rFonts w:hint="eastAsia" w:eastAsia="宋体"/>
+          <w:lang w:eastAsia="zh-CN"/>
+        </w:rPr>
       </w:pPr>
       <w:r>
-        <w:t xml:space="preserve">The source data and fixed split are in data/thinfilm_dataset.npz; model definitions and TMM implementation are in src/ai4s_thinfilm/model.py and src/ai4s_thinfilm/tmm.py. Main Linear metrics and histories are in outputs_convergence_linear/mlp_metrics.json and loss_history_train_500,1000,2000,4000.csv; the main checkpoint is models_convergence_linear/mlp_train_4000.pt. Candidate screening is in outputs_convergence_linear/design_screening_predictions.npz; full-pool TMM ranking and report are in outputs_convergence_linear/global_tmm_audit/linear_candidate_tmm_ranked.csv and linear_global_tmm_audit_report.json. Held-out example values are in paper/heldout_test_case_row_3477_spectra.csv. Repository: </w:t>
-      </w:r>
-      <w:r>
-        <w:fldChar w:fldCharType="begin"/>
-      </w:r>
-      <w:r>
-        <w:instrText xml:space="preserve"> HYPERLINK "https://github.com/xiong1971511-maker/ai4s-thinfilm-project" \h </w:instrText>
-      </w:r>
-      <w:r>
-        <w:fldChar w:fldCharType="separate"/>
-      </w:r>
-      <w:r>
         <w:rPr>
-          <w:color w:val="0563C1"/>
-          <w:u w:val="single"/>
+          <w:rFonts w:hint="eastAsia" w:eastAsia="宋体"/>
+          <w:lang w:eastAsia="zh-CN"/>
         </w:rPr>
-        <w:t>https://github.com/xiong1971511-maker/ai4s-thinfilm-project</w:t>
-      </w:r>
-      <w:r>
-        <w:rPr>
-          <w:color w:val="0563C1"/>
-          <w:u w:val="single"/>
-        </w:rPr>
-        <w:fldChar w:fldCharType="end"/>
-      </w:r>
-      <w:r>
-        <w:t>. The current manuscript and working-tree artifacts have not been confirmed as published at that URL.</w:t>
+        <w:t>The source data and fixed split are in data/thinfilm_dataset.npz; model definitions and TMM implementation are in src/ai4s_thinfilm/model.py and src/ai4s_thinfilm/tmm.py. Main Linear metrics and histories are in outputs_convergence_linear/mlp_metrics.json and loss_history_train_500,1000,2000,4000.csv; the main checkpoint is models_convergence_linear/mlp_train_4000.pt. Candidate screening is in outputs_convergence_linear/design_screening_predictions.npz; full-pool TMM ranking and report are in outputs_convergence_linear/global_tmm_audit/linear_candidate_tmm_ranked.csv and linear_global_tmm_audit_report.json. Held-out example values are in paper/heldout_test_case_row_3477_spectra.csv. Repository: https://github.com/xiong1971511-maker/ai4s-thinfilm-project. The source code, data, cited results, manuscript, and PDF are included in this repository.</w:t>
       </w:r>
     </w:p>
     <w:p>

</xml_diff>

<commit_message>
Add Chinese-English article headings, captions and reproducible bilingual figures
</commit_message>
<xml_diff>
--- a/paper/AI4S_ThinFilm_Research_Article_Submission.docx
+++ b/paper/AI4S_ThinFilm_Research_Article_Submission.docx
@@ -12,7 +12,7 @@
           <w:b/>
           <w:sz w:val="18"/>
         </w:rPr>
-        <w:t>RESEARCH ARTICLE</w:t>
+        <w:t>研究论文 / RESEARCH ARTICLE</w:t>
       </w:r>
     </w:p>
     <w:p>
@@ -71,6 +71,12 @@
         <w:snapToGrid w:val="0"/>
       </w:pPr>
       <w:r>
+        <w:t xml:space="preserve">摘要 / </w:t>
+      </w:r>
+      <w:r>
+        <w:rPr>
+          <w:sz w:val="22"/>
+        </w:rPr>
         <w:t>Abstract</w:t>
       </w:r>
     </w:p>
@@ -85,8 +91,16 @@
     <w:p>
       <w:pPr>
         <w:snapToGrid w:val="0"/>
+        <w:spacing w:line="240" w:lineRule="auto"/>
+        <w:ind w:firstLine="0"/>
+        <w:jc w:val="left"/>
       </w:pPr>
       <w:r>
+        <w:rPr>
+          <w:sz w:val="18"/>
+        </w:rPr>
+        <w:t>关键词：光学薄膜；传输矩阵法；多层感知机；代理模型；AI for Science</w:t>
+        <w:br/>
         <w:t>Keywords: optical thin films; transfer matrix method; multilayer perceptron; surrogate model; AI for Science</w:t>
       </w:r>
     </w:p>
@@ -96,7 +110,13 @@
         <w:snapToGrid w:val="0"/>
       </w:pPr>
       <w:r>
-        <w:t>1. Introduction</w:t>
+        <w:t xml:space="preserve">1. 引言 / </w:t>
+      </w:r>
+      <w:r>
+        <w:rPr>
+          <w:sz w:val="22"/>
+        </w:rPr>
+        <w:t>Introduction</w:t>
       </w:r>
     </w:p>
     <w:p>
@@ -121,7 +141,13 @@
         <w:snapToGrid w:val="0"/>
       </w:pPr>
       <w:r>
-        <w:t>2. Materials and Methods</w:t>
+        <w:t xml:space="preserve">2. 材料与方法 / </w:t>
+      </w:r>
+      <w:r>
+        <w:rPr>
+          <w:sz w:val="22"/>
+        </w:rPr>
+        <w:t>Materials and Methods</w:t>
       </w:r>
     </w:p>
     <w:p>
@@ -130,7 +156,13 @@
         <w:snapToGrid w:val="0"/>
       </w:pPr>
       <w:r>
-        <w:t>2.1 Optical model and transfer matrix method</w:t>
+        <w:t xml:space="preserve">2.1 光学模型与传输矩阵法 / </w:t>
+      </w:r>
+      <w:r>
+        <w:rPr>
+          <w:sz w:val="21"/>
+        </w:rPr>
+        <w:t>Optical model and TMM</w:t>
       </w:r>
     </w:p>
     <w:p>
@@ -277,19 +309,18 @@
     </w:p>
     <w:p>
       <w:pPr>
+        <w:pStyle w:val="21"/>
+        <w:pageBreakBefore/>
         <w:snapToGrid w:val="0"/>
       </w:pPr>
       <w:r>
-        <w:br w:type="page"/>
+        <w:t xml:space="preserve">2.2 个性化参数与固定数据集 / </w:t>
       </w:r>
-    </w:p>
-    <w:p>
-      <w:pPr>
-        <w:pStyle w:val="21"/>
-        <w:snapToGrid w:val="0"/>
-      </w:pPr>
       <w:r>
-        <w:t>2.2 Personal parameters and fixed dataset</w:t>
+        <w:rPr>
+          <w:sz w:val="21"/>
+        </w:rPr>
+        <w:t>Parameters and fixed dataset</w:t>
       </w:r>
     </w:p>
     <w:p>
@@ -314,7 +345,13 @@
         <w:snapToGrid w:val="0"/>
       </w:pPr>
       <w:r>
-        <w:t>2.3 MLP and training-size experiment</w:t>
+        <w:t xml:space="preserve">2.3 MLP 与训练规模实验 / </w:t>
+      </w:r>
+      <w:r>
+        <w:rPr>
+          <w:sz w:val="21"/>
+        </w:rPr>
+        <w:t>MLP and training-size experiment</w:t>
       </w:r>
     </w:p>
     <w:p>
@@ -322,7 +359,7 @@
         <w:snapToGrid w:val="0"/>
       </w:pPr>
       <w:r>
-        <w:t>MLP结构为4–128–128–64–41，隐藏层使用ReLU，输出层为Linear。膜厚按(d−40)/140缩放至[0,1]，反射率保持原数值尺度。训练使用CPU、Adam、学习率0.001、MSE损失和128批大小；最多2,500轮，验证MSE改善阈值为10⁻⁸，连续100轮未改善时早停并恢复最佳权重。测试集仅在检查点选择后评估。</w:t>
+        <w:t>MLP 为4–128–128–64–41，隐藏层ReLU、输出层Linear。输入按(d−40)/140缩放至[0,1]；反射率保持原尺度。采用CPU、Adam（学习率0.001）、MSE与批大小128，最多2,500轮。验证MSE改善阈值10⁻⁸，连续100轮未改善则早停并恢复最佳权重；选定检查点后才评估测试集。</w:t>
       </w:r>
     </w:p>
     <w:p>
@@ -339,7 +376,13 @@
         <w:snapToGrid w:val="0"/>
       </w:pPr>
       <w:r>
-        <w:t>2.4 MLP-assisted screening and TMM verification</w:t>
+        <w:t xml:space="preserve">2.4 代理筛选与 TMM 验证 / </w:t>
+      </w:r>
+      <w:r>
+        <w:rPr>
+          <w:sz w:val="21"/>
+        </w:rPr>
+        <w:t>Surrogate screening and TMM verification</w:t>
       </w:r>
     </w:p>
     <w:p>
@@ -347,21 +390,22 @@
         <w:snapToGrid w:val="0"/>
       </w:pPr>
       <w:r>
-        <w:t>用design_seed生成10,000组新候选，按MLP预测的R(700 nm)分别形成最小化和最大化Top 10；以TMM重算这两个短名单，得到各自Top 5。另对同一10,000组候选的全光谱进行TMM复核，用于评估短名单与全池排名差异。全池极值仅指有限随机池，不能推断连续膜厚空间的全局最优。</w:t>
+        <w:t>用design_seed生成10,000组新候选，按MLP预测R(700 nm)分别选出最小化与最大化Top 10，再经TMM重算得到各自Top 5。额外重算同池全部41点光谱，比较短名单与全池排名。有限随机池极值不能代表连续膜厚空间的全局最优。</w:t>
       </w:r>
     </w:p>
     <w:p>
       <w:pPr>
-        <w:spacing w:after="40"/>
+        <w:spacing w:after="20"/>
         <w:ind w:firstLine="0"/>
         <w:jc w:val="center"/>
+        <w:keepNext/>
         <w:snapToGrid w:val="0"/>
       </w:pPr>
       <w:r>
         <w:drawing>
           <wp:inline xmlns:a="http://schemas.openxmlformats.org/drawingml/2006/main" xmlns:pic="http://schemas.openxmlformats.org/drawingml/2006/picture">
             <wp:extent cx="5029200" cy="3374020"/>
-            <wp:docPr id="4" name="Picture 4"/>
+            <wp:docPr id="7" name="Picture 7"/>
             <wp:cNvGraphicFramePr>
               <a:graphicFrameLocks noChangeAspect="1"/>
             </wp:cNvGraphicFramePr>
@@ -373,7 +417,7 @@
                     <pic:cNvPicPr/>
                   </pic:nvPicPr>
                   <pic:blipFill>
-                    <a:blip r:embed="rId18"/>
+                    <a:blip r:embed="rId21"/>
                     <a:stretch>
                       <a:fillRect/>
                     </a:stretch>
@@ -394,81 +438,101 @@
     </w:p>
     <w:p>
       <w:pPr>
-        <w:spacing w:line="240" w:lineRule="auto" w:after="100"/>
+        <w:spacing w:line="240" w:lineRule="auto" w:after="80" w:before="20"/>
         <w:ind w:firstLine="0"/>
         <w:jc w:val="center"/>
+        <w:keepLines/>
         <w:snapToGrid w:val="0"/>
       </w:pPr>
       <w:r>
         <w:rPr>
           <w:sz w:val="18"/>
         </w:rPr>
-        <w:t>Figure 1. (a) Optical stack and TMM data generation; (b) Linear MLP architecture; (c) validation MSE versus training size; (d) main-model loss histories. All panels use the published Linear artifacts.</w:t>
+        <w:t>图 1. (a) 膜系结构与 TMM 数据生成；(b) 线性输出 MLP；(c) 训练规模与验证 MSE；(d) 主模型损失曲线。均来自已发布的线性主模型材料。</w:t>
+        <w:br/>
+      </w:r>
+      <w:r>
+        <w:rPr>
+          <w:sz w:val="17"/>
+        </w:rPr>
+        <w:t>Figure 1. (a) Optical stack and TMM data; (b) Linear-output MLP; (c) training size and validation MSE; (d) main-model losses. All panels use published Linear artifacts.</w:t>
       </w:r>
     </w:p>
     <w:p>
       <w:pPr>
+        <w:pStyle w:val="1"/>
+        <w:pageBreakBefore/>
         <w:snapToGrid w:val="0"/>
       </w:pPr>
       <w:r>
-        <w:br w:type="page"/>
+        <w:t xml:space="preserve">3. 结果 / </w:t>
+      </w:r>
+      <w:r>
+        <w:rPr>
+          <w:sz w:val="22"/>
+        </w:rPr>
+        <w:t>Results</w:t>
       </w:r>
     </w:p>
     <w:p>
       <w:pPr>
-        <w:pStyle w:val="1"/>
+        <w:pStyle w:val="21"/>
         <w:snapToGrid w:val="0"/>
       </w:pPr>
       <w:r>
-        <w:t>3. Results</w:t>
+        <w:t xml:space="preserve">3.1 训练与测试集预测 / </w:t>
+      </w:r>
+      <w:r>
+        <w:rPr>
+          <w:sz w:val="21"/>
+        </w:rPr>
+        <w:t>Training and held-out prediction</w:t>
       </w:r>
     </w:p>
     <w:p>
       <w:pPr>
-        <w:pStyle w:val="21"/>
         <w:snapToGrid w:val="0"/>
       </w:pPr>
       <w:r>
-        <w:t>3.1 Training and held-out prediction</w:t>
+        <w:t>4,000样本模型在第1,538轮取得最佳验证MSE=0.000165209，训练至第1,638轮后停止。测试集全谱MSE=0.000129391、RMSE=0.0113750、MAE=0.00829062、R²=0.996053。图 3a给出固定测试集前三个样本（全局行3758、4346、4153）的光谱对比；主谱峰及谷的位置与TMM结果接近。</w:t>
       </w:r>
     </w:p>
     <w:p>
       <w:pPr>
+        <w:pStyle w:val="21"/>
         <w:snapToGrid w:val="0"/>
       </w:pPr>
       <w:r>
-        <w:t>4,000样本模型在第1,538轮取得最佳验证MSE=0.000165209，训练至第1,638轮后停止。测试集全谱MSE=0.000129391、RMSE=0.0113750、MAE=0.00829062、R²=0.996053。Figure 3a给出固定测试集前三个样本（全局行3758、4346、4153）的光谱对比；主谱峰及谷的位置与TMM结果接近。</w:t>
+        <w:t xml:space="preserve">3.2 候选池与代理排序 / </w:t>
+      </w:r>
+      <w:r>
+        <w:rPr>
+          <w:sz w:val="21"/>
+        </w:rPr>
+        <w:t>Candidate pool and surrogate ranking</w:t>
       </w:r>
     </w:p>
     <w:p>
       <w:pPr>
-        <w:pStyle w:val="21"/>
         <w:snapToGrid w:val="0"/>
       </w:pPr>
       <w:r>
-        <w:t>3.2 Candidate pool and surrogate ranking</w:t>
+        <w:t>候选池700 nm预测值为−0.0262941至0.6682479，其中41个（0.41%）越出[0,1]。这些预测可用于代理排序，但不构成物理反射率。全池TMM最低值为0.00020416604（候选3405），最高值为0.65699974（候选2256），其预测与真实光谱见图 2a。</w:t>
       </w:r>
     </w:p>
     <w:p>
       <w:pPr>
-        <w:snapToGrid w:val="0"/>
-      </w:pPr>
-      <w:r>
-        <w:t>候选池700 nm预测值为−0.0262941至0.6682479，其中41个（0.41%）越出[0,1]。这些预测可用于代理排序，但不构成物理反射率。全池TMM最低值为0.00020416604（候选3405），最高值为0.65699974（候选2256），其预测与真实光谱见Figure 2a。</w:t>
-      </w:r>
-    </w:p>
-    <w:p>
-      <w:pPr>
-        <w:spacing w:after="40"/>
+        <w:spacing w:after="20"/>
         <w:ind w:firstLine="0"/>
         <w:jc w:val="center"/>
+        <w:keepNext/>
         <w:snapToGrid w:val="0"/>
       </w:pPr>
       <w:r>
         <w:drawing>
           <wp:inline xmlns:a="http://schemas.openxmlformats.org/drawingml/2006/main" xmlns:pic="http://schemas.openxmlformats.org/drawingml/2006/picture">
-            <wp:extent cx="5623560" cy="5297193"/>
-            <wp:docPr id="5" name="Picture 5"/>
+            <wp:extent cx="5486400" cy="5167993"/>
+            <wp:docPr id="8" name="Picture 8"/>
             <wp:cNvGraphicFramePr>
               <a:graphicFrameLocks noChangeAspect="1"/>
             </wp:cNvGraphicFramePr>
@@ -480,7 +544,7 @@
                     <pic:cNvPicPr/>
                   </pic:nvPicPr>
                   <pic:blipFill>
-                    <a:blip r:embed="rId19"/>
+                    <a:blip r:embed="rId22"/>
                     <a:stretch>
                       <a:fillRect/>
                     </a:stretch>
@@ -488,7 +552,7 @@
                   <pic:spPr>
                     <a:xfrm>
                       <a:off x="0" y="0"/>
-                      <a:ext cx="5623560" cy="5297193"/>
+                      <a:ext cx="5486400" cy="5167993"/>
                     </a:xfrm>
                     <a:prstGeom prst="rect"/>
                   </pic:spPr>
@@ -501,55 +565,63 @@
     </w:p>
     <w:p>
       <w:pPr>
-        <w:spacing w:line="240" w:lineRule="auto" w:after="100"/>
+        <w:spacing w:line="240" w:lineRule="auto" w:after="80" w:before="20"/>
         <w:ind w:firstLine="0"/>
         <w:jc w:val="center"/>
+        <w:keepLines/>
         <w:snapToGrid w:val="0"/>
       </w:pPr>
       <w:r>
         <w:rPr>
           <w:sz w:val="18"/>
         </w:rPr>
-        <w:t>Figure 2. (a) Linear predictions against full-pool TMM values and spectra of the pool extrema; (b) TMM verification of each MLP Top-10 shortlist and its best verified spectrum. Shortlist ranks and full-pool ranks are distinct.</w:t>
+        <w:t>图 2. (a) 全候选池的 MLP–TMM 对比及全池极值光谱；(b) 两个 MLP 前 10 短名单的 TMM 复核与最优光谱。短名单排名与全池排名不同。</w:t>
+        <w:br/>
+      </w:r>
+      <w:r>
+        <w:rPr>
+          <w:sz w:val="17"/>
+        </w:rPr>
+        <w:t>Figure 2. (a) Full-pool MLP–TMM comparison and extrema spectra; (b) TMM verification and best spectra of both MLP Top-10 shortlists. Shortlist and pool ranks differ.</w:t>
       </w:r>
     </w:p>
     <w:p>
       <w:pPr>
+        <w:pStyle w:val="21"/>
+        <w:pageBreakBefore/>
         <w:snapToGrid w:val="0"/>
       </w:pPr>
       <w:r>
-        <w:br w:type="page"/>
+        <w:t xml:space="preserve">3.3 训练数据量的影响 / </w:t>
+      </w:r>
+      <w:r>
+        <w:rPr>
+          <w:sz w:val="21"/>
+        </w:rPr>
+        <w:t>Effect of training-set size</w:t>
       </w:r>
     </w:p>
     <w:p>
       <w:pPr>
-        <w:pStyle w:val="21"/>
         <w:snapToGrid w:val="0"/>
       </w:pPr>
       <w:r>
-        <w:t>3.3 Effect of training-set size</w:t>
+        <w:t>500、1,000、2,000和4,000组训练的测试RMSE分别为0.027351、0.019207、0.012742和0.011375（图 3d）。样本量从500增至4,000时误差下降约58.41%，后期增益减小。500和2,000组达到2,500轮上限；这说明有限预算下误差改善，但不能断言各规模均已充分收敛。</w:t>
       </w:r>
     </w:p>
     <w:p>
       <w:pPr>
-        <w:snapToGrid w:val="0"/>
-      </w:pPr>
-      <w:r>
-        <w:t>500、1,000、2,000和4,000组训练的测试RMSE分别为0.027351、0.019207、0.012742和0.011375（Figure 3d）。样本量从500增至4,000时误差下降约58.41%，后期增益减小。500和2,000组达到2,500轮上限；这说明有限预算下误差改善，但不能断言各规模均已充分收敛。</w:t>
-      </w:r>
-    </w:p>
-    <w:p>
-      <w:pPr>
-        <w:spacing w:after="40"/>
+        <w:spacing w:after="20"/>
         <w:ind w:firstLine="0"/>
         <w:jc w:val="center"/>
+        <w:keepNext/>
         <w:snapToGrid w:val="0"/>
       </w:pPr>
       <w:r>
         <w:drawing>
           <wp:inline xmlns:a="http://schemas.openxmlformats.org/drawingml/2006/main" xmlns:pic="http://schemas.openxmlformats.org/drawingml/2006/picture">
-            <wp:extent cx="5623560" cy="5297193"/>
-            <wp:docPr id="6" name="Picture 6"/>
+            <wp:extent cx="5486400" cy="5167993"/>
+            <wp:docPr id="9" name="Picture 9"/>
             <wp:cNvGraphicFramePr>
               <a:graphicFrameLocks noChangeAspect="1"/>
             </wp:cNvGraphicFramePr>
@@ -561,7 +633,7 @@
                     <pic:cNvPicPr/>
                   </pic:nvPicPr>
                   <pic:blipFill>
-                    <a:blip r:embed="rId20"/>
+                    <a:blip r:embed="rId23"/>
                     <a:stretch>
                       <a:fillRect/>
                     </a:stretch>
@@ -569,7 +641,7 @@
                   <pic:spPr>
                     <a:xfrm>
                       <a:off x="0" y="0"/>
-                      <a:ext cx="5623560" cy="5297193"/>
+                      <a:ext cx="5486400" cy="5167993"/>
                     </a:xfrm>
                     <a:prstGeom prst="rect"/>
                   </pic:spPr>
@@ -582,16 +654,24 @@
     </w:p>
     <w:p>
       <w:pPr>
-        <w:spacing w:line="240" w:lineRule="auto" w:after="100"/>
+        <w:spacing w:line="240" w:lineRule="auto" w:after="80" w:before="20"/>
         <w:ind w:firstLine="0"/>
         <w:jc w:val="center"/>
+        <w:keepLines/>
         <w:snapToGrid w:val="0"/>
       </w:pPr>
       <w:r>
         <w:rPr>
           <w:sz w:val="18"/>
         </w:rPr>
-        <w:t>Figure 3. (a1–a3) First three fixed-test spectra; (b) highest-RMSE held-out case and its absolute error; (c) training/validation MSE; (d) test RMSE versus training size. The failure case is test item 313, global row 3477, selected by 41-point RMSE.</w:t>
+        <w:t>图 3. (a1–a3) 固定测试集前三个光谱；(b) 最高 RMSE 案例与绝对误差；(c) 训练与验证 MSE；(d) 数据量与测试 RMSE。案例为测试样本 313、全局行 3477。</w:t>
+        <w:br/>
+      </w:r>
+      <w:r>
+        <w:rPr>
+          <w:sz w:val="17"/>
+        </w:rPr>
+        <w:t>Figure 3. (a1–a3) First three fixed-test spectra; (b) highest-RMSE case and absolute error; (c) training/validation MSE; (d) training size and test RMSE. Case: test item 313, row 3477.</w:t>
       </w:r>
     </w:p>
     <w:p>
@@ -600,7 +680,13 @@
         <w:snapToGrid w:val="0"/>
       </w:pPr>
       <w:r>
-        <w:t>3.4 Representative failure case</w:t>
+        <w:t xml:space="preserve">3.4 代表性失败案例 / </w:t>
+      </w:r>
+      <w:r>
+        <w:rPr>
+          <w:sz w:val="21"/>
+        </w:rPr>
+        <w:t>Representative failure case</w:t>
       </w:r>
     </w:p>
     <w:p>
@@ -613,64 +699,73 @@
     </w:p>
     <w:p>
       <w:pPr>
+        <w:pStyle w:val="21"/>
+        <w:pageBreakBefore/>
         <w:snapToGrid w:val="0"/>
       </w:pPr>
       <w:r>
-        <w:br w:type="page"/>
+        <w:t xml:space="preserve">3.5 经 TMM 验证的短名单 / </w:t>
+      </w:r>
+      <w:r>
+        <w:rPr>
+          <w:sz w:val="21"/>
+        </w:rPr>
+        <w:t>TMM-verified shortlists</w:t>
       </w:r>
     </w:p>
     <w:p>
       <w:pPr>
-        <w:pStyle w:val="21"/>
         <w:snapToGrid w:val="0"/>
       </w:pPr>
       <w:r>
-        <w:t>3.5 TMM-verified final shortlists</w:t>
+        <w:t>表 1按TMM真实反射率给出每个MLP Top-10短名单内的Top 5。最小化短名单最优为候选7207，R(700 nm)=0.001913；最大化短名单最优为候选2256，R=0.657000。全池TMM Top 5与MLP Top 10的重合数分别为0/5和3/5，最大化方向重合候选为2256、4011、7220。</w:t>
       </w:r>
     </w:p>
     <w:p>
       <w:pPr>
-        <w:snapToGrid w:val="0"/>
-      </w:pPr>
-      <w:r>
-        <w:t>Table 1按TMM真实反射率给出每个MLP Top-10短名单内的Top 5。最小化短名单最优为候选7207，R(700 nm)=0.001913；最大化短名单最优为候选2256，R=0.657000。全池TMM Top 5与MLP Top 10的重合数分别为0/5和3/5，最大化方向重合候选为2256、4011、7220。</w:t>
-      </w:r>
-    </w:p>
-    <w:p>
-      <w:pPr>
-        <w:spacing w:line="240" w:lineRule="auto" w:after="100"/>
+        <w:spacing w:line="240" w:lineRule="auto" w:after="80" w:before="20"/>
         <w:ind w:firstLine="0"/>
         <w:jc w:val="center"/>
+        <w:keepLines/>
         <w:snapToGrid w:val="0"/>
       </w:pPr>
       <w:r>
         <w:rPr>
           <w:sz w:val="18"/>
         </w:rPr>
-        <w:t>Table 1. Top five TMM-verified designs within each MLP Top-10 shortlist. IDs are zero-based candidate indices; ranks apply within the shortlist. Thicknesses are rounded to 0.1 nm for display.</w:t>
+        <w:t>表 1. 每个 MLP 前 10 短名单内经 TMM 验证的前 5 个设计。编号从 0 起，排名仅限短名单；膜厚显示至 0.1 nm。</w:t>
+        <w:br/>
+      </w:r>
+      <w:r>
+        <w:rPr>
+          <w:sz w:val="17"/>
+        </w:rPr>
+        <w:t>Table 1. TMM-verified Top 5 within each MLP Top-10 shortlist. IDs are zero-based; ranks are within each shortlist. Thicknesses are rounded to 0.1 nm.</w:t>
       </w:r>
     </w:p>
     <w:tbl>
       <w:tblPr>
         <w:tblStyle w:val="aff1"/>
         <w:tblW w:type="auto" w:w="0"/>
+        <w:tblLayout w:type="fixed"/>
         <w:tblLook w:firstColumn="1" w:firstRow="1" w:lastColumn="0" w:lastRow="0" w:noHBand="0" w:noVBand="1" w:val="04A0"/>
       </w:tblPr>
       <w:tblGrid>
-        <w:gridCol w:w="1440"/>
-        <w:gridCol w:w="648"/>
+        <w:gridCol w:w="1584"/>
+        <w:gridCol w:w="720"/>
         <w:gridCol w:w="864"/>
-        <w:gridCol w:w="4176"/>
-        <w:gridCol w:w="1584"/>
+        <w:gridCol w:w="3888"/>
+        <w:gridCol w:w="2160"/>
       </w:tblGrid>
       <w:tr>
         <w:tc>
           <w:tcPr>
-            <w:tcW w:type="dxa" w:w="2033"/>
+            <w:tcW w:type="dxa" w:w="1584"/>
+            <w:vAlign w:val="center"/>
           </w:tcPr>
           <w:p>
             <w:pPr>
-              <w:spacing w:line="252" w:lineRule="auto" w:after="60" w:before="60"/>
+              <w:spacing w:line="252" w:lineRule="auto" w:after="40" w:before="40"/>
               <w:ind w:firstLine="0"/>
               <w:jc w:val="center"/>
               <w:snapToGrid w:val="0"/>
@@ -680,17 +775,20 @@
                 <w:b/>
                 <w:sz w:val="18"/>
               </w:rPr>
+              <w:t>方向</w:t>
+              <w:br/>
               <w:t>Direction</w:t>
             </w:r>
           </w:p>
         </w:tc>
         <w:tc>
           <w:tcPr>
-            <w:tcW w:type="dxa" w:w="2033"/>
+            <w:tcW w:type="dxa" w:w="720"/>
+            <w:vAlign w:val="center"/>
           </w:tcPr>
           <w:p>
             <w:pPr>
-              <w:spacing w:line="252" w:lineRule="auto" w:after="60" w:before="60"/>
+              <w:spacing w:line="252" w:lineRule="auto" w:after="40" w:before="40"/>
               <w:ind w:firstLine="0"/>
               <w:jc w:val="center"/>
               <w:snapToGrid w:val="0"/>
@@ -700,17 +798,20 @@
                 <w:b/>
                 <w:sz w:val="18"/>
               </w:rPr>
+              <w:t>排名</w:t>
+              <w:br/>
               <w:t>Rank</w:t>
             </w:r>
           </w:p>
         </w:tc>
         <w:tc>
           <w:tcPr>
-            <w:tcW w:type="dxa" w:w="2033"/>
+            <w:tcW w:type="dxa" w:w="864"/>
+            <w:vAlign w:val="center"/>
           </w:tcPr>
           <w:p>
             <w:pPr>
-              <w:spacing w:line="252" w:lineRule="auto" w:after="60" w:before="60"/>
+              <w:spacing w:line="252" w:lineRule="auto" w:after="40" w:before="40"/>
               <w:ind w:firstLine="0"/>
               <w:jc w:val="center"/>
               <w:snapToGrid w:val="0"/>
@@ -720,17 +821,20 @@
                 <w:b/>
                 <w:sz w:val="18"/>
               </w:rPr>
+              <w:t>编号</w:t>
+              <w:br/>
               <w:t>ID</w:t>
             </w:r>
           </w:p>
         </w:tc>
         <w:tc>
           <w:tcPr>
-            <w:tcW w:type="dxa" w:w="2033"/>
+            <w:tcW w:type="dxa" w:w="3888"/>
+            <w:vAlign w:val="center"/>
           </w:tcPr>
           <w:p>
             <w:pPr>
-              <w:spacing w:line="252" w:lineRule="auto" w:after="60" w:before="60"/>
+              <w:spacing w:line="252" w:lineRule="auto" w:after="40" w:before="40"/>
               <w:ind w:firstLine="0"/>
               <w:jc w:val="center"/>
               <w:snapToGrid w:val="0"/>
@@ -740,17 +844,20 @@
                 <w:b/>
                 <w:sz w:val="18"/>
               </w:rPr>
-              <w:t>Four-layer thickness (nm)</w:t>
+              <w:t>四层膜厚</w:t>
+              <w:br/>
+              <w:t>Thicknesses (nm)</w:t>
             </w:r>
           </w:p>
         </w:tc>
         <w:tc>
           <w:tcPr>
-            <w:tcW w:type="dxa" w:w="2033"/>
+            <w:tcW w:type="dxa" w:w="2160"/>
+            <w:vAlign w:val="center"/>
           </w:tcPr>
           <w:p>
             <w:pPr>
-              <w:spacing w:line="252" w:lineRule="auto" w:after="60" w:before="60"/>
+              <w:spacing w:line="252" w:lineRule="auto" w:after="40" w:before="40"/>
               <w:ind w:firstLine="0"/>
               <w:jc w:val="center"/>
               <w:snapToGrid w:val="0"/>
@@ -760,7 +867,9 @@
                 <w:b/>
                 <w:sz w:val="18"/>
               </w:rPr>
-              <w:t>TMM R(700 nm)</w:t>
+              <w:t>TMM 反射率</w:t>
+              <w:br/>
+              <w:t>R(700 nm)</w:t>
             </w:r>
           </w:p>
         </w:tc>
@@ -768,11 +877,12 @@
       <w:tr>
         <w:tc>
           <w:tcPr>
-            <w:tcW w:type="dxa" w:w="2033"/>
+            <w:tcW w:type="dxa" w:w="1584"/>
+            <w:vAlign w:val="center"/>
           </w:tcPr>
           <w:p>
             <w:pPr>
-              <w:spacing w:line="252" w:lineRule="auto" w:after="60" w:before="60"/>
+              <w:spacing w:line="252" w:lineRule="auto" w:after="40" w:before="40"/>
               <w:ind w:firstLine="0"/>
               <w:jc w:val="center"/>
               <w:snapToGrid w:val="0"/>
@@ -781,17 +891,18 @@
               <w:rPr>
                 <w:sz w:val="18"/>
               </w:rPr>
-              <w:t>Minimize</w:t>
+              <w:t>最小化 / Min</w:t>
             </w:r>
           </w:p>
         </w:tc>
         <w:tc>
           <w:tcPr>
-            <w:tcW w:type="dxa" w:w="2033"/>
+            <w:tcW w:type="dxa" w:w="720"/>
+            <w:vAlign w:val="center"/>
           </w:tcPr>
           <w:p>
             <w:pPr>
-              <w:spacing w:line="252" w:lineRule="auto" w:after="60" w:before="60"/>
+              <w:spacing w:line="252" w:lineRule="auto" w:after="40" w:before="40"/>
               <w:ind w:firstLine="0"/>
               <w:jc w:val="center"/>
               <w:snapToGrid w:val="0"/>
@@ -806,11 +917,12 @@
         </w:tc>
         <w:tc>
           <w:tcPr>
-            <w:tcW w:type="dxa" w:w="2033"/>
+            <w:tcW w:type="dxa" w:w="864"/>
+            <w:vAlign w:val="center"/>
           </w:tcPr>
           <w:p>
             <w:pPr>
-              <w:spacing w:line="252" w:lineRule="auto" w:after="60" w:before="60"/>
+              <w:spacing w:line="252" w:lineRule="auto" w:after="40" w:before="40"/>
               <w:ind w:firstLine="0"/>
               <w:jc w:val="center"/>
               <w:snapToGrid w:val="0"/>
@@ -825,11 +937,12 @@
         </w:tc>
         <w:tc>
           <w:tcPr>
-            <w:tcW w:type="dxa" w:w="2033"/>
+            <w:tcW w:type="dxa" w:w="3888"/>
+            <w:vAlign w:val="center"/>
           </w:tcPr>
           <w:p>
             <w:pPr>
-              <w:spacing w:line="252" w:lineRule="auto" w:after="60" w:before="60"/>
+              <w:spacing w:line="252" w:lineRule="auto" w:after="40" w:before="40"/>
               <w:ind w:firstLine="0"/>
               <w:jc w:val="center"/>
               <w:snapToGrid w:val="0"/>
@@ -844,11 +957,12 @@
         </w:tc>
         <w:tc>
           <w:tcPr>
-            <w:tcW w:type="dxa" w:w="2033"/>
+            <w:tcW w:type="dxa" w:w="2160"/>
+            <w:vAlign w:val="center"/>
           </w:tcPr>
           <w:p>
             <w:pPr>
-              <w:spacing w:line="252" w:lineRule="auto" w:after="60" w:before="60"/>
+              <w:spacing w:line="252" w:lineRule="auto" w:after="40" w:before="40"/>
               <w:ind w:firstLine="0"/>
               <w:jc w:val="center"/>
               <w:snapToGrid w:val="0"/>
@@ -865,11 +979,12 @@
       <w:tr>
         <w:tc>
           <w:tcPr>
-            <w:tcW w:type="dxa" w:w="2033"/>
+            <w:tcW w:type="dxa" w:w="1584"/>
+            <w:vAlign w:val="center"/>
           </w:tcPr>
           <w:p>
             <w:pPr>
-              <w:spacing w:line="252" w:lineRule="auto" w:after="60" w:before="60"/>
+              <w:spacing w:line="252" w:lineRule="auto" w:after="40" w:before="40"/>
               <w:ind w:firstLine="0"/>
               <w:jc w:val="center"/>
               <w:snapToGrid w:val="0"/>
@@ -878,17 +993,18 @@
               <w:rPr>
                 <w:sz w:val="18"/>
               </w:rPr>
-              <w:t>Minimize</w:t>
+              <w:t>最小化 / Min</w:t>
             </w:r>
           </w:p>
         </w:tc>
         <w:tc>
           <w:tcPr>
-            <w:tcW w:type="dxa" w:w="2033"/>
+            <w:tcW w:type="dxa" w:w="720"/>
+            <w:vAlign w:val="center"/>
           </w:tcPr>
           <w:p>
             <w:pPr>
-              <w:spacing w:line="252" w:lineRule="auto" w:after="60" w:before="60"/>
+              <w:spacing w:line="252" w:lineRule="auto" w:after="40" w:before="40"/>
               <w:ind w:firstLine="0"/>
               <w:jc w:val="center"/>
               <w:snapToGrid w:val="0"/>
@@ -903,11 +1019,12 @@
         </w:tc>
         <w:tc>
           <w:tcPr>
-            <w:tcW w:type="dxa" w:w="2033"/>
+            <w:tcW w:type="dxa" w:w="864"/>
+            <w:vAlign w:val="center"/>
           </w:tcPr>
           <w:p>
             <w:pPr>
-              <w:spacing w:line="252" w:lineRule="auto" w:after="60" w:before="60"/>
+              <w:spacing w:line="252" w:lineRule="auto" w:after="40" w:before="40"/>
               <w:ind w:firstLine="0"/>
               <w:jc w:val="center"/>
               <w:snapToGrid w:val="0"/>
@@ -922,11 +1039,12 @@
         </w:tc>
         <w:tc>
           <w:tcPr>
-            <w:tcW w:type="dxa" w:w="2033"/>
+            <w:tcW w:type="dxa" w:w="3888"/>
+            <w:vAlign w:val="center"/>
           </w:tcPr>
           <w:p>
             <w:pPr>
-              <w:spacing w:line="252" w:lineRule="auto" w:after="60" w:before="60"/>
+              <w:spacing w:line="252" w:lineRule="auto" w:after="40" w:before="40"/>
               <w:ind w:firstLine="0"/>
               <w:jc w:val="center"/>
               <w:snapToGrid w:val="0"/>
@@ -941,11 +1059,12 @@
         </w:tc>
         <w:tc>
           <w:tcPr>
-            <w:tcW w:type="dxa" w:w="2033"/>
+            <w:tcW w:type="dxa" w:w="2160"/>
+            <w:vAlign w:val="center"/>
           </w:tcPr>
           <w:p>
             <w:pPr>
-              <w:spacing w:line="252" w:lineRule="auto" w:after="60" w:before="60"/>
+              <w:spacing w:line="252" w:lineRule="auto" w:after="40" w:before="40"/>
               <w:ind w:firstLine="0"/>
               <w:jc w:val="center"/>
               <w:snapToGrid w:val="0"/>
@@ -962,11 +1081,12 @@
       <w:tr>
         <w:tc>
           <w:tcPr>
-            <w:tcW w:type="dxa" w:w="2033"/>
+            <w:tcW w:type="dxa" w:w="1584"/>
+            <w:vAlign w:val="center"/>
           </w:tcPr>
           <w:p>
             <w:pPr>
-              <w:spacing w:line="252" w:lineRule="auto" w:after="60" w:before="60"/>
+              <w:spacing w:line="252" w:lineRule="auto" w:after="40" w:before="40"/>
               <w:ind w:firstLine="0"/>
               <w:jc w:val="center"/>
               <w:snapToGrid w:val="0"/>
@@ -975,17 +1095,18 @@
               <w:rPr>
                 <w:sz w:val="18"/>
               </w:rPr>
-              <w:t>Minimize</w:t>
+              <w:t>最小化 / Min</w:t>
             </w:r>
           </w:p>
         </w:tc>
         <w:tc>
           <w:tcPr>
-            <w:tcW w:type="dxa" w:w="2033"/>
+            <w:tcW w:type="dxa" w:w="720"/>
+            <w:vAlign w:val="center"/>
           </w:tcPr>
           <w:p>
             <w:pPr>
-              <w:spacing w:line="252" w:lineRule="auto" w:after="60" w:before="60"/>
+              <w:spacing w:line="252" w:lineRule="auto" w:after="40" w:before="40"/>
               <w:ind w:firstLine="0"/>
               <w:jc w:val="center"/>
               <w:snapToGrid w:val="0"/>
@@ -1000,11 +1121,12 @@
         </w:tc>
         <w:tc>
           <w:tcPr>
-            <w:tcW w:type="dxa" w:w="2033"/>
+            <w:tcW w:type="dxa" w:w="864"/>
+            <w:vAlign w:val="center"/>
           </w:tcPr>
           <w:p>
             <w:pPr>
-              <w:spacing w:line="252" w:lineRule="auto" w:after="60" w:before="60"/>
+              <w:spacing w:line="252" w:lineRule="auto" w:after="40" w:before="40"/>
               <w:ind w:firstLine="0"/>
               <w:jc w:val="center"/>
               <w:snapToGrid w:val="0"/>
@@ -1019,11 +1141,12 @@
         </w:tc>
         <w:tc>
           <w:tcPr>
-            <w:tcW w:type="dxa" w:w="2033"/>
+            <w:tcW w:type="dxa" w:w="3888"/>
+            <w:vAlign w:val="center"/>
           </w:tcPr>
           <w:p>
             <w:pPr>
-              <w:spacing w:line="252" w:lineRule="auto" w:after="60" w:before="60"/>
+              <w:spacing w:line="252" w:lineRule="auto" w:after="40" w:before="40"/>
               <w:ind w:firstLine="0"/>
               <w:jc w:val="center"/>
               <w:snapToGrid w:val="0"/>
@@ -1038,11 +1161,12 @@
         </w:tc>
         <w:tc>
           <w:tcPr>
-            <w:tcW w:type="dxa" w:w="2033"/>
+            <w:tcW w:type="dxa" w:w="2160"/>
+            <w:vAlign w:val="center"/>
           </w:tcPr>
           <w:p>
             <w:pPr>
-              <w:spacing w:line="252" w:lineRule="auto" w:after="60" w:before="60"/>
+              <w:spacing w:line="252" w:lineRule="auto" w:after="40" w:before="40"/>
               <w:ind w:firstLine="0"/>
               <w:jc w:val="center"/>
               <w:snapToGrid w:val="0"/>
@@ -1059,11 +1183,12 @@
       <w:tr>
         <w:tc>
           <w:tcPr>
-            <w:tcW w:type="dxa" w:w="2033"/>
+            <w:tcW w:type="dxa" w:w="1584"/>
+            <w:vAlign w:val="center"/>
           </w:tcPr>
           <w:p>
             <w:pPr>
-              <w:spacing w:line="252" w:lineRule="auto" w:after="60" w:before="60"/>
+              <w:spacing w:line="252" w:lineRule="auto" w:after="40" w:before="40"/>
               <w:ind w:firstLine="0"/>
               <w:jc w:val="center"/>
               <w:snapToGrid w:val="0"/>
@@ -1072,17 +1197,18 @@
               <w:rPr>
                 <w:sz w:val="18"/>
               </w:rPr>
-              <w:t>Minimize</w:t>
+              <w:t>最小化 / Min</w:t>
             </w:r>
           </w:p>
         </w:tc>
         <w:tc>
           <w:tcPr>
-            <w:tcW w:type="dxa" w:w="2033"/>
+            <w:tcW w:type="dxa" w:w="720"/>
+            <w:vAlign w:val="center"/>
           </w:tcPr>
           <w:p>
             <w:pPr>
-              <w:spacing w:line="252" w:lineRule="auto" w:after="60" w:before="60"/>
+              <w:spacing w:line="252" w:lineRule="auto" w:after="40" w:before="40"/>
               <w:ind w:firstLine="0"/>
               <w:jc w:val="center"/>
               <w:snapToGrid w:val="0"/>
@@ -1097,11 +1223,12 @@
         </w:tc>
         <w:tc>
           <w:tcPr>
-            <w:tcW w:type="dxa" w:w="2033"/>
+            <w:tcW w:type="dxa" w:w="864"/>
+            <w:vAlign w:val="center"/>
           </w:tcPr>
           <w:p>
             <w:pPr>
-              <w:spacing w:line="252" w:lineRule="auto" w:after="60" w:before="60"/>
+              <w:spacing w:line="252" w:lineRule="auto" w:after="40" w:before="40"/>
               <w:ind w:firstLine="0"/>
               <w:jc w:val="center"/>
               <w:snapToGrid w:val="0"/>
@@ -1116,11 +1243,12 @@
         </w:tc>
         <w:tc>
           <w:tcPr>
-            <w:tcW w:type="dxa" w:w="2033"/>
+            <w:tcW w:type="dxa" w:w="3888"/>
+            <w:vAlign w:val="center"/>
           </w:tcPr>
           <w:p>
             <w:pPr>
-              <w:spacing w:line="252" w:lineRule="auto" w:after="60" w:before="60"/>
+              <w:spacing w:line="252" w:lineRule="auto" w:after="40" w:before="40"/>
               <w:ind w:firstLine="0"/>
               <w:jc w:val="center"/>
               <w:snapToGrid w:val="0"/>
@@ -1135,11 +1263,12 @@
         </w:tc>
         <w:tc>
           <w:tcPr>
-            <w:tcW w:type="dxa" w:w="2033"/>
+            <w:tcW w:type="dxa" w:w="2160"/>
+            <w:vAlign w:val="center"/>
           </w:tcPr>
           <w:p>
             <w:pPr>
-              <w:spacing w:line="252" w:lineRule="auto" w:after="60" w:before="60"/>
+              <w:spacing w:line="252" w:lineRule="auto" w:after="40" w:before="40"/>
               <w:ind w:firstLine="0"/>
               <w:jc w:val="center"/>
               <w:snapToGrid w:val="0"/>
@@ -1156,11 +1285,12 @@
       <w:tr>
         <w:tc>
           <w:tcPr>
-            <w:tcW w:type="dxa" w:w="2033"/>
+            <w:tcW w:type="dxa" w:w="1584"/>
+            <w:vAlign w:val="center"/>
           </w:tcPr>
           <w:p>
             <w:pPr>
-              <w:spacing w:line="252" w:lineRule="auto" w:after="60" w:before="60"/>
+              <w:spacing w:line="252" w:lineRule="auto" w:after="40" w:before="40"/>
               <w:ind w:firstLine="0"/>
               <w:jc w:val="center"/>
               <w:snapToGrid w:val="0"/>
@@ -1169,17 +1299,18 @@
               <w:rPr>
                 <w:sz w:val="18"/>
               </w:rPr>
-              <w:t>Minimize</w:t>
+              <w:t>最小化 / Min</w:t>
             </w:r>
           </w:p>
         </w:tc>
         <w:tc>
           <w:tcPr>
-            <w:tcW w:type="dxa" w:w="2033"/>
+            <w:tcW w:type="dxa" w:w="720"/>
+            <w:vAlign w:val="center"/>
           </w:tcPr>
           <w:p>
             <w:pPr>
-              <w:spacing w:line="252" w:lineRule="auto" w:after="60" w:before="60"/>
+              <w:spacing w:line="252" w:lineRule="auto" w:after="40" w:before="40"/>
               <w:ind w:firstLine="0"/>
               <w:jc w:val="center"/>
               <w:snapToGrid w:val="0"/>
@@ -1194,11 +1325,12 @@
         </w:tc>
         <w:tc>
           <w:tcPr>
-            <w:tcW w:type="dxa" w:w="2033"/>
+            <w:tcW w:type="dxa" w:w="864"/>
+            <w:vAlign w:val="center"/>
           </w:tcPr>
           <w:p>
             <w:pPr>
-              <w:spacing w:line="252" w:lineRule="auto" w:after="60" w:before="60"/>
+              <w:spacing w:line="252" w:lineRule="auto" w:after="40" w:before="40"/>
               <w:ind w:firstLine="0"/>
               <w:jc w:val="center"/>
               <w:snapToGrid w:val="0"/>
@@ -1213,11 +1345,12 @@
         </w:tc>
         <w:tc>
           <w:tcPr>
-            <w:tcW w:type="dxa" w:w="2033"/>
+            <w:tcW w:type="dxa" w:w="3888"/>
+            <w:vAlign w:val="center"/>
           </w:tcPr>
           <w:p>
             <w:pPr>
-              <w:spacing w:line="252" w:lineRule="auto" w:after="60" w:before="60"/>
+              <w:spacing w:line="252" w:lineRule="auto" w:after="40" w:before="40"/>
               <w:ind w:firstLine="0"/>
               <w:jc w:val="center"/>
               <w:snapToGrid w:val="0"/>
@@ -1232,11 +1365,12 @@
         </w:tc>
         <w:tc>
           <w:tcPr>
-            <w:tcW w:type="dxa" w:w="2033"/>
+            <w:tcW w:type="dxa" w:w="2160"/>
+            <w:vAlign w:val="center"/>
           </w:tcPr>
           <w:p>
             <w:pPr>
-              <w:spacing w:line="252" w:lineRule="auto" w:after="60" w:before="60"/>
+              <w:spacing w:line="252" w:lineRule="auto" w:after="40" w:before="40"/>
               <w:ind w:firstLine="0"/>
               <w:jc w:val="center"/>
               <w:snapToGrid w:val="0"/>
@@ -1253,11 +1387,12 @@
       <w:tr>
         <w:tc>
           <w:tcPr>
-            <w:tcW w:type="dxa" w:w="2033"/>
+            <w:tcW w:type="dxa" w:w="1584"/>
+            <w:vAlign w:val="center"/>
           </w:tcPr>
           <w:p>
             <w:pPr>
-              <w:spacing w:line="252" w:lineRule="auto" w:after="60" w:before="60"/>
+              <w:spacing w:line="252" w:lineRule="auto" w:after="40" w:before="40"/>
               <w:ind w:firstLine="0"/>
               <w:jc w:val="center"/>
               <w:snapToGrid w:val="0"/>
@@ -1266,17 +1401,18 @@
               <w:rPr>
                 <w:sz w:val="18"/>
               </w:rPr>
-              <w:t>Maximize</w:t>
+              <w:t>最大化 / Max</w:t>
             </w:r>
           </w:p>
         </w:tc>
         <w:tc>
           <w:tcPr>
-            <w:tcW w:type="dxa" w:w="2033"/>
+            <w:tcW w:type="dxa" w:w="720"/>
+            <w:vAlign w:val="center"/>
           </w:tcPr>
           <w:p>
             <w:pPr>
-              <w:spacing w:line="252" w:lineRule="auto" w:after="60" w:before="60"/>
+              <w:spacing w:line="252" w:lineRule="auto" w:after="40" w:before="40"/>
               <w:ind w:firstLine="0"/>
               <w:jc w:val="center"/>
               <w:snapToGrid w:val="0"/>
@@ -1291,11 +1427,12 @@
         </w:tc>
         <w:tc>
           <w:tcPr>
-            <w:tcW w:type="dxa" w:w="2033"/>
+            <w:tcW w:type="dxa" w:w="864"/>
+            <w:vAlign w:val="center"/>
           </w:tcPr>
           <w:p>
             <w:pPr>
-              <w:spacing w:line="252" w:lineRule="auto" w:after="60" w:before="60"/>
+              <w:spacing w:line="252" w:lineRule="auto" w:after="40" w:before="40"/>
               <w:ind w:firstLine="0"/>
               <w:jc w:val="center"/>
               <w:snapToGrid w:val="0"/>
@@ -1310,11 +1447,12 @@
         </w:tc>
         <w:tc>
           <w:tcPr>
-            <w:tcW w:type="dxa" w:w="2033"/>
+            <w:tcW w:type="dxa" w:w="3888"/>
+            <w:vAlign w:val="center"/>
           </w:tcPr>
           <w:p>
             <w:pPr>
-              <w:spacing w:line="252" w:lineRule="auto" w:after="60" w:before="60"/>
+              <w:spacing w:line="252" w:lineRule="auto" w:after="40" w:before="40"/>
               <w:ind w:firstLine="0"/>
               <w:jc w:val="center"/>
               <w:snapToGrid w:val="0"/>
@@ -1329,11 +1467,12 @@
         </w:tc>
         <w:tc>
           <w:tcPr>
-            <w:tcW w:type="dxa" w:w="2033"/>
+            <w:tcW w:type="dxa" w:w="2160"/>
+            <w:vAlign w:val="center"/>
           </w:tcPr>
           <w:p>
             <w:pPr>
-              <w:spacing w:line="252" w:lineRule="auto" w:after="60" w:before="60"/>
+              <w:spacing w:line="252" w:lineRule="auto" w:after="40" w:before="40"/>
               <w:ind w:firstLine="0"/>
               <w:jc w:val="center"/>
               <w:snapToGrid w:val="0"/>
@@ -1350,11 +1489,12 @@
       <w:tr>
         <w:tc>
           <w:tcPr>
-            <w:tcW w:type="dxa" w:w="2033"/>
+            <w:tcW w:type="dxa" w:w="1584"/>
+            <w:vAlign w:val="center"/>
           </w:tcPr>
           <w:p>
             <w:pPr>
-              <w:spacing w:line="252" w:lineRule="auto" w:after="60" w:before="60"/>
+              <w:spacing w:line="252" w:lineRule="auto" w:after="40" w:before="40"/>
               <w:ind w:firstLine="0"/>
               <w:jc w:val="center"/>
               <w:snapToGrid w:val="0"/>
@@ -1363,17 +1503,18 @@
               <w:rPr>
                 <w:sz w:val="18"/>
               </w:rPr>
-              <w:t>Maximize</w:t>
+              <w:t>最大化 / Max</w:t>
             </w:r>
           </w:p>
         </w:tc>
         <w:tc>
           <w:tcPr>
-            <w:tcW w:type="dxa" w:w="2033"/>
+            <w:tcW w:type="dxa" w:w="720"/>
+            <w:vAlign w:val="center"/>
           </w:tcPr>
           <w:p>
             <w:pPr>
-              <w:spacing w:line="252" w:lineRule="auto" w:after="60" w:before="60"/>
+              <w:spacing w:line="252" w:lineRule="auto" w:after="40" w:before="40"/>
               <w:ind w:firstLine="0"/>
               <w:jc w:val="center"/>
               <w:snapToGrid w:val="0"/>
@@ -1388,11 +1529,12 @@
         </w:tc>
         <w:tc>
           <w:tcPr>
-            <w:tcW w:type="dxa" w:w="2033"/>
+            <w:tcW w:type="dxa" w:w="864"/>
+            <w:vAlign w:val="center"/>
           </w:tcPr>
           <w:p>
             <w:pPr>
-              <w:spacing w:line="252" w:lineRule="auto" w:after="60" w:before="60"/>
+              <w:spacing w:line="252" w:lineRule="auto" w:after="40" w:before="40"/>
               <w:ind w:firstLine="0"/>
               <w:jc w:val="center"/>
               <w:snapToGrid w:val="0"/>
@@ -1407,11 +1549,12 @@
         </w:tc>
         <w:tc>
           <w:tcPr>
-            <w:tcW w:type="dxa" w:w="2033"/>
+            <w:tcW w:type="dxa" w:w="3888"/>
+            <w:vAlign w:val="center"/>
           </w:tcPr>
           <w:p>
             <w:pPr>
-              <w:spacing w:line="252" w:lineRule="auto" w:after="60" w:before="60"/>
+              <w:spacing w:line="252" w:lineRule="auto" w:after="40" w:before="40"/>
               <w:ind w:firstLine="0"/>
               <w:jc w:val="center"/>
               <w:snapToGrid w:val="0"/>
@@ -1426,11 +1569,12 @@
         </w:tc>
         <w:tc>
           <w:tcPr>
-            <w:tcW w:type="dxa" w:w="2033"/>
+            <w:tcW w:type="dxa" w:w="2160"/>
+            <w:vAlign w:val="center"/>
           </w:tcPr>
           <w:p>
             <w:pPr>
-              <w:spacing w:line="252" w:lineRule="auto" w:after="60" w:before="60"/>
+              <w:spacing w:line="252" w:lineRule="auto" w:after="40" w:before="40"/>
               <w:ind w:firstLine="0"/>
               <w:jc w:val="center"/>
               <w:snapToGrid w:val="0"/>
@@ -1447,11 +1591,12 @@
       <w:tr>
         <w:tc>
           <w:tcPr>
-            <w:tcW w:type="dxa" w:w="2033"/>
+            <w:tcW w:type="dxa" w:w="1584"/>
+            <w:vAlign w:val="center"/>
           </w:tcPr>
           <w:p>
             <w:pPr>
-              <w:spacing w:line="252" w:lineRule="auto" w:after="60" w:before="60"/>
+              <w:spacing w:line="252" w:lineRule="auto" w:after="40" w:before="40"/>
               <w:ind w:firstLine="0"/>
               <w:jc w:val="center"/>
               <w:snapToGrid w:val="0"/>
@@ -1460,17 +1605,18 @@
               <w:rPr>
                 <w:sz w:val="18"/>
               </w:rPr>
-              <w:t>Maximize</w:t>
+              <w:t>最大化 / Max</w:t>
             </w:r>
           </w:p>
         </w:tc>
         <w:tc>
           <w:tcPr>
-            <w:tcW w:type="dxa" w:w="2033"/>
+            <w:tcW w:type="dxa" w:w="720"/>
+            <w:vAlign w:val="center"/>
           </w:tcPr>
           <w:p>
             <w:pPr>
-              <w:spacing w:line="252" w:lineRule="auto" w:after="60" w:before="60"/>
+              <w:spacing w:line="252" w:lineRule="auto" w:after="40" w:before="40"/>
               <w:ind w:firstLine="0"/>
               <w:jc w:val="center"/>
               <w:snapToGrid w:val="0"/>
@@ -1485,11 +1631,12 @@
         </w:tc>
         <w:tc>
           <w:tcPr>
-            <w:tcW w:type="dxa" w:w="2033"/>
+            <w:tcW w:type="dxa" w:w="864"/>
+            <w:vAlign w:val="center"/>
           </w:tcPr>
           <w:p>
             <w:pPr>
-              <w:spacing w:line="252" w:lineRule="auto" w:after="60" w:before="60"/>
+              <w:spacing w:line="252" w:lineRule="auto" w:after="40" w:before="40"/>
               <w:ind w:firstLine="0"/>
               <w:jc w:val="center"/>
               <w:snapToGrid w:val="0"/>
@@ -1504,11 +1651,12 @@
         </w:tc>
         <w:tc>
           <w:tcPr>
-            <w:tcW w:type="dxa" w:w="2033"/>
+            <w:tcW w:type="dxa" w:w="3888"/>
+            <w:vAlign w:val="center"/>
           </w:tcPr>
           <w:p>
             <w:pPr>
-              <w:spacing w:line="252" w:lineRule="auto" w:after="60" w:before="60"/>
+              <w:spacing w:line="252" w:lineRule="auto" w:after="40" w:before="40"/>
               <w:ind w:firstLine="0"/>
               <w:jc w:val="center"/>
               <w:snapToGrid w:val="0"/>
@@ -1523,11 +1671,12 @@
         </w:tc>
         <w:tc>
           <w:tcPr>
-            <w:tcW w:type="dxa" w:w="2033"/>
+            <w:tcW w:type="dxa" w:w="2160"/>
+            <w:vAlign w:val="center"/>
           </w:tcPr>
           <w:p>
             <w:pPr>
-              <w:spacing w:line="252" w:lineRule="auto" w:after="60" w:before="60"/>
+              <w:spacing w:line="252" w:lineRule="auto" w:after="40" w:before="40"/>
               <w:ind w:firstLine="0"/>
               <w:jc w:val="center"/>
               <w:snapToGrid w:val="0"/>
@@ -1544,11 +1693,12 @@
       <w:tr>
         <w:tc>
           <w:tcPr>
-            <w:tcW w:type="dxa" w:w="2033"/>
+            <w:tcW w:type="dxa" w:w="1584"/>
+            <w:vAlign w:val="center"/>
           </w:tcPr>
           <w:p>
             <w:pPr>
-              <w:spacing w:line="252" w:lineRule="auto" w:after="60" w:before="60"/>
+              <w:spacing w:line="252" w:lineRule="auto" w:after="40" w:before="40"/>
               <w:ind w:firstLine="0"/>
               <w:jc w:val="center"/>
               <w:snapToGrid w:val="0"/>
@@ -1557,17 +1707,18 @@
               <w:rPr>
                 <w:sz w:val="18"/>
               </w:rPr>
-              <w:t>Maximize</w:t>
+              <w:t>最大化 / Max</w:t>
             </w:r>
           </w:p>
         </w:tc>
         <w:tc>
           <w:tcPr>
-            <w:tcW w:type="dxa" w:w="2033"/>
+            <w:tcW w:type="dxa" w:w="720"/>
+            <w:vAlign w:val="center"/>
           </w:tcPr>
           <w:p>
             <w:pPr>
-              <w:spacing w:line="252" w:lineRule="auto" w:after="60" w:before="60"/>
+              <w:spacing w:line="252" w:lineRule="auto" w:after="40" w:before="40"/>
               <w:ind w:firstLine="0"/>
               <w:jc w:val="center"/>
               <w:snapToGrid w:val="0"/>
@@ -1582,11 +1733,12 @@
         </w:tc>
         <w:tc>
           <w:tcPr>
-            <w:tcW w:type="dxa" w:w="2033"/>
+            <w:tcW w:type="dxa" w:w="864"/>
+            <w:vAlign w:val="center"/>
           </w:tcPr>
           <w:p>
             <w:pPr>
-              <w:spacing w:line="252" w:lineRule="auto" w:after="60" w:before="60"/>
+              <w:spacing w:line="252" w:lineRule="auto" w:after="40" w:before="40"/>
               <w:ind w:firstLine="0"/>
               <w:jc w:val="center"/>
               <w:snapToGrid w:val="0"/>
@@ -1601,11 +1753,12 @@
         </w:tc>
         <w:tc>
           <w:tcPr>
-            <w:tcW w:type="dxa" w:w="2033"/>
+            <w:tcW w:type="dxa" w:w="3888"/>
+            <w:vAlign w:val="center"/>
           </w:tcPr>
           <w:p>
             <w:pPr>
-              <w:spacing w:line="252" w:lineRule="auto" w:after="60" w:before="60"/>
+              <w:spacing w:line="252" w:lineRule="auto" w:after="40" w:before="40"/>
               <w:ind w:firstLine="0"/>
               <w:jc w:val="center"/>
               <w:snapToGrid w:val="0"/>
@@ -1620,11 +1773,12 @@
         </w:tc>
         <w:tc>
           <w:tcPr>
-            <w:tcW w:type="dxa" w:w="2033"/>
+            <w:tcW w:type="dxa" w:w="2160"/>
+            <w:vAlign w:val="center"/>
           </w:tcPr>
           <w:p>
             <w:pPr>
-              <w:spacing w:line="252" w:lineRule="auto" w:after="60" w:before="60"/>
+              <w:spacing w:line="252" w:lineRule="auto" w:after="40" w:before="40"/>
               <w:ind w:firstLine="0"/>
               <w:jc w:val="center"/>
               <w:snapToGrid w:val="0"/>
@@ -1641,11 +1795,12 @@
       <w:tr>
         <w:tc>
           <w:tcPr>
-            <w:tcW w:type="dxa" w:w="2033"/>
+            <w:tcW w:type="dxa" w:w="1584"/>
+            <w:vAlign w:val="center"/>
           </w:tcPr>
           <w:p>
             <w:pPr>
-              <w:spacing w:line="252" w:lineRule="auto" w:after="60" w:before="60"/>
+              <w:spacing w:line="252" w:lineRule="auto" w:after="40" w:before="40"/>
               <w:ind w:firstLine="0"/>
               <w:jc w:val="center"/>
               <w:snapToGrid w:val="0"/>
@@ -1654,17 +1809,18 @@
               <w:rPr>
                 <w:sz w:val="18"/>
               </w:rPr>
-              <w:t>Maximize</w:t>
+              <w:t>最大化 / Max</w:t>
             </w:r>
           </w:p>
         </w:tc>
         <w:tc>
           <w:tcPr>
-            <w:tcW w:type="dxa" w:w="2033"/>
+            <w:tcW w:type="dxa" w:w="720"/>
+            <w:vAlign w:val="center"/>
           </w:tcPr>
           <w:p>
             <w:pPr>
-              <w:spacing w:line="252" w:lineRule="auto" w:after="60" w:before="60"/>
+              <w:spacing w:line="252" w:lineRule="auto" w:after="40" w:before="40"/>
               <w:ind w:firstLine="0"/>
               <w:jc w:val="center"/>
               <w:snapToGrid w:val="0"/>
@@ -1679,11 +1835,12 @@
         </w:tc>
         <w:tc>
           <w:tcPr>
-            <w:tcW w:type="dxa" w:w="2033"/>
+            <w:tcW w:type="dxa" w:w="864"/>
+            <w:vAlign w:val="center"/>
           </w:tcPr>
           <w:p>
             <w:pPr>
-              <w:spacing w:line="252" w:lineRule="auto" w:after="60" w:before="60"/>
+              <w:spacing w:line="252" w:lineRule="auto" w:after="40" w:before="40"/>
               <w:ind w:firstLine="0"/>
               <w:jc w:val="center"/>
               <w:snapToGrid w:val="0"/>
@@ -1698,11 +1855,12 @@
         </w:tc>
         <w:tc>
           <w:tcPr>
-            <w:tcW w:type="dxa" w:w="2033"/>
+            <w:tcW w:type="dxa" w:w="3888"/>
+            <w:vAlign w:val="center"/>
           </w:tcPr>
           <w:p>
             <w:pPr>
-              <w:spacing w:line="252" w:lineRule="auto" w:after="60" w:before="60"/>
+              <w:spacing w:line="252" w:lineRule="auto" w:after="40" w:before="40"/>
               <w:ind w:firstLine="0"/>
               <w:jc w:val="center"/>
               <w:snapToGrid w:val="0"/>
@@ -1717,11 +1875,12 @@
         </w:tc>
         <w:tc>
           <w:tcPr>
-            <w:tcW w:type="dxa" w:w="2033"/>
+            <w:tcW w:type="dxa" w:w="2160"/>
+            <w:vAlign w:val="center"/>
           </w:tcPr>
           <w:p>
             <w:pPr>
-              <w:spacing w:line="252" w:lineRule="auto" w:after="60" w:before="60"/>
+              <w:spacing w:line="252" w:lineRule="auto" w:after="40" w:before="40"/>
               <w:ind w:firstLine="0"/>
               <w:jc w:val="center"/>
               <w:snapToGrid w:val="0"/>
@@ -1742,7 +1901,13 @@
         <w:snapToGrid w:val="0"/>
       </w:pPr>
       <w:r>
-        <w:t>4. Discussion</w:t>
+        <w:t xml:space="preserve">4. 讨论 / </w:t>
+      </w:r>
+      <w:r>
+        <w:rPr>
+          <w:sz w:val="22"/>
+        </w:rPr>
+        <w:t>Discussion</w:t>
       </w:r>
     </w:p>
     <w:p>
@@ -1775,7 +1940,13 @@
         <w:snapToGrid w:val="0"/>
       </w:pPr>
       <w:r>
-        <w:t>4.1 Limitations</w:t>
+        <w:t xml:space="preserve">4.1 研究局限 / </w:t>
+      </w:r>
+      <w:r>
+        <w:rPr>
+          <w:sz w:val="21"/>
+        </w:rPr>
+        <w:t>Limitations</w:t>
       </w:r>
     </w:p>
     <w:p>
@@ -1788,19 +1959,18 @@
     </w:p>
     <w:p>
       <w:pPr>
+        <w:pStyle w:val="1"/>
+        <w:pageBreakBefore/>
         <w:snapToGrid w:val="0"/>
       </w:pPr>
       <w:r>
-        <w:br w:type="page"/>
+        <w:t xml:space="preserve">5. 结论 / </w:t>
       </w:r>
-    </w:p>
-    <w:p>
-      <w:pPr>
-        <w:pStyle w:val="1"/>
-        <w:snapToGrid w:val="0"/>
-      </w:pPr>
       <w:r>
-        <w:t>5. Conclusions</w:t>
+        <w:rPr>
+          <w:sz w:val="22"/>
+        </w:rPr>
+        <w:t>Conclusions</w:t>
       </w:r>
     </w:p>
     <w:p>
@@ -1817,15 +1987,30 @@
         <w:snapToGrid w:val="0"/>
       </w:pPr>
       <w:r>
+        <w:t xml:space="preserve">数据与代码可用性 / </w:t>
+      </w:r>
+      <w:r>
+        <w:rPr>
+          <w:sz w:val="22"/>
+        </w:rPr>
         <w:t>Data and Code Availability</w:t>
       </w:r>
     </w:p>
     <w:p>
       <w:pPr>
         <w:snapToGrid w:val="0"/>
+        <w:spacing w:line="252" w:lineRule="auto" w:after="80"/>
+        <w:jc w:val="left"/>
       </w:pPr>
       <w:r>
-        <w:t>All source code, the fixed TMM dataset, published Linear checkpoint, loss histories, candidate spectra, ranked design tables and final article are available in the public repository:</w:t>
+        <w:t>源代码、固定 TMM 数据、线性主模型检查点、损失历史、候选光谱、设计表和论文均可在下列公开仓库获取。</w:t>
+        <w:br/>
+      </w:r>
+      <w:r>
+        <w:rPr>
+          <w:sz w:val="18"/>
+        </w:rPr>
+        <w:t>Source code, fixed TMM data, the Linear checkpoint, loss histories, candidate spectra, design tables and article are available in this public repository.</w:t>
       </w:r>
     </w:p>
     <w:p>
@@ -1840,17 +2025,35 @@
     <w:p>
       <w:pPr>
         <w:snapToGrid w:val="0"/>
+        <w:spacing w:line="252" w:lineRule="auto" w:after="80"/>
+        <w:jc w:val="left"/>
       </w:pPr>
       <w:r>
-        <w:t>The README reports target=700 nm, seed=270256 and design_seed=270257, with commands for data generation, training, screening, verification and figure reproduction. The dataset is data/thinfilm_dataset.npz; the main checkpoint is models_convergence_linear/mlp_train_4000.pt. Training and design results are in outputs_convergence_linear/. Figure sources and their manifest are in paper/figures/. The held-out case is provided as paper/heldout_test_case_row_3477_spectra.csv.</w:t>
+        <w:t>README 记录 700 nm、seed=270256、design_seed=270257 及全流程命令。数据位于 data/thinfilm_dataset.npz，主检查点为 models_convergence_linear/mlp_train_4000.pt；训练与设计结果在 outputs_convergence_linear/，图源在 paper/figures/，高误差案例为 paper/heldout_test_case_row_3477_spectra.csv。</w:t>
+        <w:br/>
+      </w:r>
+      <w:r>
+        <w:rPr>
+          <w:sz w:val="18"/>
+        </w:rPr>
+        <w:t>The README records 700 nm, seed=270256, design_seed=270257 and reproduction commands. Data: data/thinfilm_dataset.npz; checkpoint: models_convergence_linear/mlp_train_4000.pt; results: outputs_convergence_linear/; figures: paper/figures/; held-out case: paper/heldout_test_case_row_3477_spectra.csv.</w:t>
       </w:r>
     </w:p>
     <w:p>
       <w:pPr>
         <w:snapToGrid w:val="0"/>
+        <w:spacing w:line="252" w:lineRule="auto" w:after="80"/>
+        <w:jc w:val="left"/>
       </w:pPr>
       <w:r>
-        <w:t>Published numerical results can be verified using scripts/verify_submission.py and all three figures regenerated using scripts/make_submission_figures.py. Training from scratch uses the recorded settings; floating-point differences across operating systems and Python versions can change optimization trajectories. The repository should remain accessible throughout the semester.</w:t>
+        <w:t>数值复核与图表重建分别运行 scripts/verify_submission.py 和 scripts/make_submission_figures.py。从零训练使用已记录设置；跨平台浮点差异可能改变优化轨迹。仓库须在本学期保持可访问。</w:t>
+        <w:br/>
+      </w:r>
+      <w:r>
+        <w:rPr>
+          <w:sz w:val="18"/>
+        </w:rPr>
+        <w:t>Verify results with scripts/verify_submission.py and rebuild figures with scripts/make_submission_figures.py. From-scratch training uses the recorded settings; cross-platform floating-point differences may change optimization trajectories. Keep the repository accessible throughout the semester.</w:t>
       </w:r>
     </w:p>
     <w:p>
@@ -1859,6 +2062,12 @@
         <w:snapToGrid w:val="0"/>
       </w:pPr>
       <w:r>
+        <w:t xml:space="preserve">参考文献 / </w:t>
+      </w:r>
+      <w:r>
+        <w:rPr>
+          <w:sz w:val="22"/>
+        </w:rPr>
         <w:t>References</w:t>
       </w:r>
     </w:p>
@@ -2015,7 +2224,7 @@
         <w:color w:val="777777"/>
         <w:sz w:val="16"/>
       </w:rPr>
-      <w:t xml:space="preserve">AI4S Thin-Film Research Article  |  </w:t>
+      <w:t xml:space="preserve">薄膜研究论文 / AI4S Thin-Film Article  |  </w:t>
     </w:r>
     <w:fldSimple w:instr="PAGE"/>
   </w:p>
@@ -2663,7 +2872,7 @@
     <w:qFormat/>
     <w:rsid w:val="00FC693F"/>
     <w:pPr>
-      <w:spacing w:after="80" w:line="269" w:lineRule="auto"/>
+      <w:spacing w:after="60" w:line="250" w:lineRule="auto"/>
       <w:ind w:firstLine="420"/>
       <w:jc w:val="both"/>
     </w:pPr>
@@ -2684,7 +2893,7 @@
     <w:pPr>
       <w:keepNext/>
       <w:keepLines/>
-      <w:spacing w:before="140" w:after="80"/>
+      <w:spacing w:before="100" w:after="60"/>
       <w:ind w:firstLine="0"/>
       <w:outlineLvl w:val="0"/>
     </w:pPr>
@@ -2709,7 +2918,7 @@
     <w:pPr>
       <w:keepNext/>
       <w:keepLines/>
-      <w:spacing w:before="140" w:after="80"/>
+      <w:spacing w:before="100" w:after="60"/>
       <w:ind w:firstLine="0"/>
       <w:outlineLvl w:val="1"/>
     </w:pPr>

</xml_diff>